<commit_message>
actualizacion:DOCUMENTO SUBIDO A PDF
</commit_message>
<xml_diff>
--- a/Actividad_1_Jonathan_Vega.docx
+++ b/Actividad_1_Jonathan_Vega.docx
@@ -297,7 +297,23 @@
           <w:sz w:val="28"/>
           <w:szCs w:val="28"/>
         </w:rPr>
-        <w:t>Roly Steeven Cedeño Menéndez, Mtr.</w:t>
+        <w:t xml:space="preserve">Roly Steeven Cedeño Menéndez, </w:t>
+      </w:r>
+      <w:proofErr w:type="spellStart"/>
+      <w:r>
+        <w:rPr>
+          <w:sz w:val="28"/>
+          <w:szCs w:val="28"/>
+        </w:rPr>
+        <w:t>Mtr</w:t>
+      </w:r>
+      <w:proofErr w:type="spellEnd"/>
+      <w:r>
+        <w:rPr>
+          <w:sz w:val="28"/>
+          <w:szCs w:val="28"/>
+        </w:rPr>
+        <w:t>.</w:t>
       </w:r>
     </w:p>
     <w:tbl>
@@ -1683,7 +1699,35 @@
           <w:szCs w:val="20"/>
           <w:lang w:eastAsia="es-EC"/>
         </w:rPr>
-        <w:t>2. Diagrama de Casos de Uso (UML / Mermaid)</w:t>
+        <w:t xml:space="preserve">2. Diagrama de Casos de Uso (UML / </w:t>
+      </w:r>
+      <w:proofErr w:type="spellStart"/>
+      <w:r>
+        <w:rPr>
+          <w:rFonts w:ascii="Arial" w:hAnsi="Arial" w:cs="Arial"/>
+          <w:b/>
+          <w:bCs/>
+          <w:i/>
+          <w:iCs/>
+          <w:sz w:val="20"/>
+          <w:szCs w:val="20"/>
+          <w:lang w:eastAsia="es-EC"/>
+        </w:rPr>
+        <w:t>Mermaid</w:t>
+      </w:r>
+      <w:proofErr w:type="spellEnd"/>
+      <w:r>
+        <w:rPr>
+          <w:rFonts w:ascii="Arial" w:hAnsi="Arial" w:cs="Arial"/>
+          <w:b/>
+          <w:bCs/>
+          <w:i/>
+          <w:iCs/>
+          <w:sz w:val="20"/>
+          <w:szCs w:val="20"/>
+          <w:lang w:eastAsia="es-EC"/>
+        </w:rPr>
+        <w:t>)</w:t>
       </w:r>
     </w:p>
     <w:p>
@@ -1731,9 +1775,9 @@
           <w:lang w:eastAsia="es-EC"/>
         </w:rPr>
         <w:drawing>
-          <wp:inline distT="0" distB="0" distL="0" distR="0" wp14:anchorId="37E9FBCE" wp14:editId="266DD22D">
-            <wp:extent cx="5400040" cy="2623185"/>
-            <wp:effectExtent l="0" t="0" r="0" b="5715"/>
+          <wp:inline distT="0" distB="0" distL="0" distR="0" wp14:anchorId="37E9FBCE" wp14:editId="1BBD581D">
+            <wp:extent cx="5777821" cy="2806700"/>
+            <wp:effectExtent l="0" t="0" r="0" b="0"/>
             <wp:docPr id="2" name="Imagen 2"/>
             <wp:cNvGraphicFramePr>
               <a:graphicFrameLocks xmlns:a="http://schemas.openxmlformats.org/drawingml/2006/main" noChangeAspect="1"/>
@@ -1760,7 +1804,7 @@
                   <pic:spPr>
                     <a:xfrm>
                       <a:off x="0" y="0"/>
-                      <a:ext cx="5400040" cy="2623185"/>
+                      <a:ext cx="5780137" cy="2807825"/>
                     </a:xfrm>
                     <a:prstGeom prst="rect">
                       <a:avLst/>
@@ -1772,6 +1816,19 @@
           </wp:inline>
         </w:drawing>
       </w:r>
+    </w:p>
+    <w:p>
+      <w:pPr>
+        <w:pStyle w:val="Encabezado"/>
+        <w:spacing w:line="360" w:lineRule="auto"/>
+        <w:jc w:val="both"/>
+        <w:rPr>
+          <w:rFonts w:ascii="Arial" w:hAnsi="Arial" w:cs="Arial"/>
+          <w:b/>
+          <w:bCs/>
+          <w:lang w:eastAsia="es-EC"/>
+        </w:rPr>
+      </w:pPr>
     </w:p>
     <w:p>
       <w:pPr>
@@ -1854,7 +1911,39 @@
           <w:rFonts w:ascii="Arial" w:hAnsi="Arial" w:cs="Arial"/>
           <w:lang w:val="es-ES" w:eastAsia="es-EC"/>
         </w:rPr>
-        <w:t>Factory Method (MascotaFactory):</w:t>
+        <w:t xml:space="preserve">Factory </w:t>
+      </w:r>
+      <w:proofErr w:type="spellStart"/>
+      <w:r>
+        <w:rPr>
+          <w:rFonts w:ascii="Arial" w:hAnsi="Arial" w:cs="Arial"/>
+          <w:lang w:val="es-ES" w:eastAsia="es-EC"/>
+        </w:rPr>
+        <w:t>Method</w:t>
+      </w:r>
+      <w:proofErr w:type="spellEnd"/>
+      <w:r>
+        <w:rPr>
+          <w:rFonts w:ascii="Arial" w:hAnsi="Arial" w:cs="Arial"/>
+          <w:lang w:val="es-ES" w:eastAsia="es-EC"/>
+        </w:rPr>
+        <w:t xml:space="preserve"> (</w:t>
+      </w:r>
+      <w:proofErr w:type="spellStart"/>
+      <w:r>
+        <w:rPr>
+          <w:rFonts w:ascii="Arial" w:hAnsi="Arial" w:cs="Arial"/>
+          <w:lang w:val="es-ES" w:eastAsia="es-EC"/>
+        </w:rPr>
+        <w:t>MascotaFactory</w:t>
+      </w:r>
+      <w:proofErr w:type="spellEnd"/>
+      <w:r>
+        <w:rPr>
+          <w:rFonts w:ascii="Arial" w:hAnsi="Arial" w:cs="Arial"/>
+          <w:lang w:val="es-ES" w:eastAsia="es-EC"/>
+        </w:rPr>
+        <w:t>):</w:t>
       </w:r>
     </w:p>
     <w:p>
@@ -1880,6 +1969,7 @@
           <w:rFonts w:ascii="Arial" w:hAnsi="Arial" w:cs="Arial"/>
           <w:lang w:val="es-ES" w:eastAsia="es-EC"/>
         </w:rPr>
+        <w:lastRenderedPageBreak/>
         <w:t>Propósito: Creación dinámica de diferentes tipos de animales (ej. Perro, Gato, Ave) sin acoplar la lógica de creación a las clases concretas.</w:t>
       </w:r>
     </w:p>
@@ -1910,7 +2000,6 @@
           <w:bCs/>
           <w:lang w:val="es-ES" w:eastAsia="es-EC"/>
         </w:rPr>
-        <w:lastRenderedPageBreak/>
         <w:t xml:space="preserve">Patrón Estructural </w:t>
       </w:r>
       <w:r>
@@ -1918,7 +2007,39 @@
           <w:rFonts w:ascii="Arial" w:hAnsi="Arial" w:cs="Arial"/>
           <w:lang w:val="es-ES" w:eastAsia="es-EC"/>
         </w:rPr>
-        <w:t>— Adapter (NotificadorAdapter):</w:t>
+        <w:t xml:space="preserve">— </w:t>
+      </w:r>
+      <w:proofErr w:type="spellStart"/>
+      <w:r>
+        <w:rPr>
+          <w:rFonts w:ascii="Arial" w:hAnsi="Arial" w:cs="Arial"/>
+          <w:lang w:val="es-ES" w:eastAsia="es-EC"/>
+        </w:rPr>
+        <w:t>Adapter</w:t>
+      </w:r>
+      <w:proofErr w:type="spellEnd"/>
+      <w:r>
+        <w:rPr>
+          <w:rFonts w:ascii="Arial" w:hAnsi="Arial" w:cs="Arial"/>
+          <w:lang w:val="es-ES" w:eastAsia="es-EC"/>
+        </w:rPr>
+        <w:t xml:space="preserve"> (</w:t>
+      </w:r>
+      <w:proofErr w:type="spellStart"/>
+      <w:r>
+        <w:rPr>
+          <w:rFonts w:ascii="Arial" w:hAnsi="Arial" w:cs="Arial"/>
+          <w:lang w:val="es-ES" w:eastAsia="es-EC"/>
+        </w:rPr>
+        <w:t>NotificadorAdapter</w:t>
+      </w:r>
+      <w:proofErr w:type="spellEnd"/>
+      <w:r>
+        <w:rPr>
+          <w:rFonts w:ascii="Arial" w:hAnsi="Arial" w:cs="Arial"/>
+          <w:lang w:val="es-ES" w:eastAsia="es-EC"/>
+        </w:rPr>
+        <w:t>):</w:t>
       </w:r>
     </w:p>
     <w:p>
@@ -1944,7 +2065,55 @@
           <w:rFonts w:ascii="Arial" w:hAnsi="Arial" w:cs="Arial"/>
           <w:lang w:val="es-ES" w:eastAsia="es-EC"/>
         </w:rPr>
-        <w:t>Propósito: Unificar diferentes proveedores de notificación externos (ej. correo electrónico mediante SendGrid o SMS/WhatsApp mediante Twilio) bajo una misma interfaz estándar INotificador.</w:t>
+        <w:t xml:space="preserve">Propósito: Unificar diferentes proveedores de notificación externos (ej. correo electrónico mediante </w:t>
+      </w:r>
+      <w:proofErr w:type="spellStart"/>
+      <w:r>
+        <w:rPr>
+          <w:rFonts w:ascii="Arial" w:hAnsi="Arial" w:cs="Arial"/>
+          <w:lang w:val="es-ES" w:eastAsia="es-EC"/>
+        </w:rPr>
+        <w:t>SendGrid</w:t>
+      </w:r>
+      <w:proofErr w:type="spellEnd"/>
+      <w:r>
+        <w:rPr>
+          <w:rFonts w:ascii="Arial" w:hAnsi="Arial" w:cs="Arial"/>
+          <w:lang w:val="es-ES" w:eastAsia="es-EC"/>
+        </w:rPr>
+        <w:t xml:space="preserve"> o SMS/WhatsApp mediante </w:t>
+      </w:r>
+      <w:proofErr w:type="spellStart"/>
+      <w:r>
+        <w:rPr>
+          <w:rFonts w:ascii="Arial" w:hAnsi="Arial" w:cs="Arial"/>
+          <w:lang w:val="es-ES" w:eastAsia="es-EC"/>
+        </w:rPr>
+        <w:t>Twilio</w:t>
+      </w:r>
+      <w:proofErr w:type="spellEnd"/>
+      <w:r>
+        <w:rPr>
+          <w:rFonts w:ascii="Arial" w:hAnsi="Arial" w:cs="Arial"/>
+          <w:lang w:val="es-ES" w:eastAsia="es-EC"/>
+        </w:rPr>
+        <w:t xml:space="preserve">) bajo una misma interfaz estándar </w:t>
+      </w:r>
+      <w:proofErr w:type="spellStart"/>
+      <w:r>
+        <w:rPr>
+          <w:rFonts w:ascii="Arial" w:hAnsi="Arial" w:cs="Arial"/>
+          <w:lang w:val="es-ES" w:eastAsia="es-EC"/>
+        </w:rPr>
+        <w:t>INotificador</w:t>
+      </w:r>
+      <w:proofErr w:type="spellEnd"/>
+      <w:r>
+        <w:rPr>
+          <w:rFonts w:ascii="Arial" w:hAnsi="Arial" w:cs="Arial"/>
+          <w:lang w:val="es-ES" w:eastAsia="es-EC"/>
+        </w:rPr>
+        <w:t>.</w:t>
       </w:r>
     </w:p>
     <w:p>
@@ -1981,7 +2150,39 @@
           <w:rFonts w:ascii="Arial" w:hAnsi="Arial" w:cs="Arial"/>
           <w:lang w:val="es-ES" w:eastAsia="es-EC"/>
         </w:rPr>
-        <w:t>— Observer (MascotaObservable):</w:t>
+        <w:t xml:space="preserve">— </w:t>
+      </w:r>
+      <w:proofErr w:type="spellStart"/>
+      <w:r>
+        <w:rPr>
+          <w:rFonts w:ascii="Arial" w:hAnsi="Arial" w:cs="Arial"/>
+          <w:lang w:val="es-ES" w:eastAsia="es-EC"/>
+        </w:rPr>
+        <w:t>Observer</w:t>
+      </w:r>
+      <w:proofErr w:type="spellEnd"/>
+      <w:r>
+        <w:rPr>
+          <w:rFonts w:ascii="Arial" w:hAnsi="Arial" w:cs="Arial"/>
+          <w:lang w:val="es-ES" w:eastAsia="es-EC"/>
+        </w:rPr>
+        <w:t xml:space="preserve"> (</w:t>
+      </w:r>
+      <w:proofErr w:type="spellStart"/>
+      <w:r>
+        <w:rPr>
+          <w:rFonts w:ascii="Arial" w:hAnsi="Arial" w:cs="Arial"/>
+          <w:lang w:val="es-ES" w:eastAsia="es-EC"/>
+        </w:rPr>
+        <w:t>MascotaObservable</w:t>
+      </w:r>
+      <w:proofErr w:type="spellEnd"/>
+      <w:r>
+        <w:rPr>
+          <w:rFonts w:ascii="Arial" w:hAnsi="Arial" w:cs="Arial"/>
+          <w:lang w:val="es-ES" w:eastAsia="es-EC"/>
+        </w:rPr>
+        <w:t>):</w:t>
       </w:r>
     </w:p>
     <w:p>
@@ -2096,6 +2297,10 @@
     <w:p>
       <w:pPr>
         <w:pStyle w:val="Encabezado"/>
+        <w:tabs>
+          <w:tab w:val="clear" w:pos="4419"/>
+          <w:tab w:val="clear" w:pos="8838"/>
+        </w:tabs>
         <w:spacing w:line="360" w:lineRule="auto"/>
         <w:ind w:left="720"/>
         <w:jc w:val="both"/>
@@ -2106,6 +2311,20 @@
           <w:lang w:eastAsia="es-EC"/>
         </w:rPr>
       </w:pPr>
+    </w:p>
+    <w:p>
+      <w:pPr>
+        <w:pStyle w:val="Encabezado"/>
+        <w:spacing w:line="360" w:lineRule="auto"/>
+        <w:ind w:left="720"/>
+        <w:jc w:val="center"/>
+        <w:rPr>
+          <w:rFonts w:ascii="Arial" w:hAnsi="Arial" w:cs="Arial"/>
+          <w:b/>
+          <w:bCs/>
+          <w:lang w:eastAsia="es-EC"/>
+        </w:rPr>
+      </w:pPr>
       <w:r>
         <w:rPr>
           <w:rFonts w:ascii="Arial" w:hAnsi="Arial" w:cs="Arial"/>
@@ -2115,9 +2334,9 @@
           <w:lang w:eastAsia="es-EC"/>
         </w:rPr>
         <w:drawing>
-          <wp:inline distT="0" distB="0" distL="0" distR="0" wp14:anchorId="5E24C5A3" wp14:editId="43BEEE62">
-            <wp:extent cx="5400040" cy="2623185"/>
-            <wp:effectExtent l="0" t="0" r="0" b="5715"/>
+          <wp:inline distT="0" distB="0" distL="0" distR="0" wp14:anchorId="5E24C5A3" wp14:editId="634A1647">
+            <wp:extent cx="5673245" cy="2755900"/>
+            <wp:effectExtent l="0" t="0" r="3810" b="6350"/>
             <wp:docPr id="3" name="Imagen 3"/>
             <wp:cNvGraphicFramePr>
               <a:graphicFrameLocks xmlns:a="http://schemas.openxmlformats.org/drawingml/2006/main" noChangeAspect="1"/>
@@ -2144,7 +2363,7 @@
                   <pic:spPr>
                     <a:xfrm>
                       <a:off x="0" y="0"/>
-                      <a:ext cx="5400040" cy="2623185"/>
+                      <a:ext cx="5675769" cy="2757126"/>
                     </a:xfrm>
                     <a:prstGeom prst="rect">
                       <a:avLst/>
@@ -2183,8 +2402,19 @@
           <w:bCs/>
           <w:lang w:eastAsia="es-EC"/>
         </w:rPr>
-        <w:t>Secuencia de Comandos Gitflow</w:t>
-      </w:r>
+        <w:t xml:space="preserve">Secuencia de Comandos </w:t>
+      </w:r>
+      <w:proofErr w:type="spellStart"/>
+      <w:r>
+        <w:rPr>
+          <w:rFonts w:ascii="Arial" w:hAnsi="Arial" w:cs="Arial"/>
+          <w:b/>
+          <w:bCs/>
+          <w:lang w:eastAsia="es-EC"/>
+        </w:rPr>
+        <w:t>Gitflow</w:t>
+      </w:r>
+      <w:proofErr w:type="spellEnd"/>
       <w:r>
         <w:rPr>
           <w:rFonts w:ascii="Arial" w:hAnsi="Arial" w:cs="Arial"/>
@@ -2228,7 +2458,23 @@
           <w:rFonts w:ascii="Arial" w:hAnsi="Arial" w:cs="Arial"/>
           <w:lang w:eastAsia="es-EC"/>
         </w:rPr>
-        <w:t xml:space="preserve">para agg nombre. Y el comando </w:t>
+        <w:t xml:space="preserve">para </w:t>
+      </w:r>
+      <w:proofErr w:type="spellStart"/>
+      <w:r>
+        <w:rPr>
+          <w:rFonts w:ascii="Arial" w:hAnsi="Arial" w:cs="Arial"/>
+          <w:lang w:eastAsia="es-EC"/>
+        </w:rPr>
+        <w:t>agg</w:t>
+      </w:r>
+      <w:proofErr w:type="spellEnd"/>
+      <w:r>
+        <w:rPr>
+          <w:rFonts w:ascii="Arial" w:hAnsi="Arial" w:cs="Arial"/>
+          <w:lang w:eastAsia="es-EC"/>
+        </w:rPr>
+        <w:t xml:space="preserve"> nombre. Y el comando </w:t>
       </w:r>
       <w:r>
         <w:rPr>
@@ -2244,7 +2490,23 @@
           <w:rFonts w:ascii="Arial" w:hAnsi="Arial" w:cs="Arial"/>
           <w:lang w:eastAsia="es-EC"/>
         </w:rPr>
-        <w:t xml:space="preserve"> para registrar el correo, en este caso colocamos el correo instuticional.</w:t>
+        <w:t xml:space="preserve"> para registrar el correo, en este caso colocamos el correo </w:t>
+      </w:r>
+      <w:proofErr w:type="spellStart"/>
+      <w:r>
+        <w:rPr>
+          <w:rFonts w:ascii="Arial" w:hAnsi="Arial" w:cs="Arial"/>
+          <w:lang w:eastAsia="es-EC"/>
+        </w:rPr>
+        <w:t>instuticional</w:t>
+      </w:r>
+      <w:proofErr w:type="spellEnd"/>
+      <w:r>
+        <w:rPr>
+          <w:rFonts w:ascii="Arial" w:hAnsi="Arial" w:cs="Arial"/>
+          <w:lang w:eastAsia="es-EC"/>
+        </w:rPr>
+        <w:t>.</w:t>
       </w:r>
     </w:p>
     <w:p>
@@ -2257,14 +2519,45 @@
           <w:lang w:eastAsia="es-EC"/>
         </w:rPr>
       </w:pPr>
-      <w:r>
-        <w:rPr>
-          <w:rFonts w:ascii="Arial" w:hAnsi="Arial" w:cs="Arial"/>
-          <w:i/>
-          <w:iCs/>
-          <w:lang w:eastAsia="es-EC"/>
-        </w:rPr>
-        <w:t>git config –global user.name “JONATHAN”</w:t>
+      <w:proofErr w:type="spellStart"/>
+      <w:r>
+        <w:rPr>
+          <w:rFonts w:ascii="Arial" w:hAnsi="Arial" w:cs="Arial"/>
+          <w:i/>
+          <w:iCs/>
+          <w:lang w:eastAsia="es-EC"/>
+        </w:rPr>
+        <w:t>git</w:t>
+      </w:r>
+      <w:proofErr w:type="spellEnd"/>
+      <w:r>
+        <w:rPr>
+          <w:rFonts w:ascii="Arial" w:hAnsi="Arial" w:cs="Arial"/>
+          <w:i/>
+          <w:iCs/>
+          <w:lang w:eastAsia="es-EC"/>
+        </w:rPr>
+        <w:t xml:space="preserve"> </w:t>
+      </w:r>
+      <w:proofErr w:type="spellStart"/>
+      <w:r>
+        <w:rPr>
+          <w:rFonts w:ascii="Arial" w:hAnsi="Arial" w:cs="Arial"/>
+          <w:i/>
+          <w:iCs/>
+          <w:lang w:eastAsia="es-EC"/>
+        </w:rPr>
+        <w:t>config</w:t>
+      </w:r>
+      <w:proofErr w:type="spellEnd"/>
+      <w:r>
+        <w:rPr>
+          <w:rFonts w:ascii="Arial" w:hAnsi="Arial" w:cs="Arial"/>
+          <w:i/>
+          <w:iCs/>
+          <w:lang w:eastAsia="es-EC"/>
+        </w:rPr>
+        <w:t xml:space="preserve"> –global user.name “JONATHAN”</w:t>
       </w:r>
     </w:p>
     <w:p>
@@ -2277,14 +2570,67 @@
           <w:lang w:eastAsia="es-EC"/>
         </w:rPr>
       </w:pPr>
-      <w:r>
-        <w:rPr>
-          <w:rFonts w:ascii="Arial" w:hAnsi="Arial" w:cs="Arial"/>
-          <w:i/>
-          <w:iCs/>
-          <w:lang w:eastAsia="es-EC"/>
-        </w:rPr>
-        <w:t>git config –global user.email “jvega7139@utm.edu.ec”</w:t>
+      <w:proofErr w:type="spellStart"/>
+      <w:r>
+        <w:rPr>
+          <w:rFonts w:ascii="Arial" w:hAnsi="Arial" w:cs="Arial"/>
+          <w:i/>
+          <w:iCs/>
+          <w:lang w:eastAsia="es-EC"/>
+        </w:rPr>
+        <w:t>git</w:t>
+      </w:r>
+      <w:proofErr w:type="spellEnd"/>
+      <w:r>
+        <w:rPr>
+          <w:rFonts w:ascii="Arial" w:hAnsi="Arial" w:cs="Arial"/>
+          <w:i/>
+          <w:iCs/>
+          <w:lang w:eastAsia="es-EC"/>
+        </w:rPr>
+        <w:t xml:space="preserve"> </w:t>
+      </w:r>
+      <w:proofErr w:type="spellStart"/>
+      <w:r>
+        <w:rPr>
+          <w:rFonts w:ascii="Arial" w:hAnsi="Arial" w:cs="Arial"/>
+          <w:i/>
+          <w:iCs/>
+          <w:lang w:eastAsia="es-EC"/>
+        </w:rPr>
+        <w:t>config</w:t>
+      </w:r>
+      <w:proofErr w:type="spellEnd"/>
+      <w:r>
+        <w:rPr>
+          <w:rFonts w:ascii="Arial" w:hAnsi="Arial" w:cs="Arial"/>
+          <w:i/>
+          <w:iCs/>
+          <w:lang w:eastAsia="es-EC"/>
+        </w:rPr>
+        <w:t xml:space="preserve"> –global </w:t>
+      </w:r>
+      <w:proofErr w:type="spellStart"/>
+      <w:proofErr w:type="gramStart"/>
+      <w:r>
+        <w:rPr>
+          <w:rFonts w:ascii="Arial" w:hAnsi="Arial" w:cs="Arial"/>
+          <w:i/>
+          <w:iCs/>
+          <w:lang w:eastAsia="es-EC"/>
+        </w:rPr>
+        <w:t>user.email</w:t>
+      </w:r>
+      <w:proofErr w:type="spellEnd"/>
+      <w:proofErr w:type="gramEnd"/>
+      <w:r>
+        <w:rPr>
+          <w:rFonts w:ascii="Arial" w:hAnsi="Arial" w:cs="Arial"/>
+          <w:i/>
+          <w:iCs/>
+          <w:lang w:eastAsia="es-EC"/>
+        </w:rPr>
+        <w:t xml:space="preserve"> “jvega7139@utm.edu.ec”</w:t>
       </w:r>
     </w:p>
     <w:p>
@@ -2300,10 +2646,11 @@
         <w:rPr>
           <w:noProof/>
         </w:rPr>
+        <w:lastRenderedPageBreak/>
         <w:drawing>
-          <wp:inline distT="0" distB="0" distL="0" distR="0" wp14:anchorId="0ECBFC39" wp14:editId="4297C949">
-            <wp:extent cx="5400040" cy="1164590"/>
-            <wp:effectExtent l="0" t="0" r="0" b="0"/>
+          <wp:inline distT="0" distB="0" distL="0" distR="0" wp14:anchorId="0ECBFC39" wp14:editId="1CC058BC">
+            <wp:extent cx="5842000" cy="1259905"/>
+            <wp:effectExtent l="0" t="0" r="6350" b="0"/>
             <wp:docPr id="29" name="Imagen 29"/>
             <wp:cNvGraphicFramePr>
               <a:graphicFrameLocks xmlns:a="http://schemas.openxmlformats.org/drawingml/2006/main" noChangeAspect="1"/>
@@ -2324,7 +2671,7 @@
                   <pic:spPr>
                     <a:xfrm>
                       <a:off x="0" y="0"/>
-                      <a:ext cx="5400040" cy="1164590"/>
+                      <a:ext cx="5868909" cy="1265708"/>
                     </a:xfrm>
                     <a:prstGeom prst="rect">
                       <a:avLst/>
@@ -2356,7 +2703,6 @@
           <w:rFonts w:ascii="Arial" w:hAnsi="Arial" w:cs="Arial"/>
           <w:lang w:eastAsia="es-EC"/>
         </w:rPr>
-        <w:lastRenderedPageBreak/>
         <w:t xml:space="preserve">Utilizamos el comando </w:t>
       </w:r>
       <w:r>
@@ -2395,7 +2741,23 @@
           <w:rFonts w:ascii="Arial" w:hAnsi="Arial" w:cs="Arial"/>
           <w:lang w:eastAsia="es-EC"/>
         </w:rPr>
-        <w:t>En este caso nos saldrá el nombre y el correo institucional registrado del ususario.</w:t>
+        <w:t xml:space="preserve">En este caso nos saldrá el nombre y el correo institucional registrado del </w:t>
+      </w:r>
+      <w:proofErr w:type="spellStart"/>
+      <w:r>
+        <w:rPr>
+          <w:rFonts w:ascii="Arial" w:hAnsi="Arial" w:cs="Arial"/>
+          <w:lang w:eastAsia="es-EC"/>
+        </w:rPr>
+        <w:t>ususario</w:t>
+      </w:r>
+      <w:proofErr w:type="spellEnd"/>
+      <w:r>
+        <w:rPr>
+          <w:rFonts w:ascii="Arial" w:hAnsi="Arial" w:cs="Arial"/>
+          <w:lang w:eastAsia="es-EC"/>
+        </w:rPr>
+        <w:t>.</w:t>
       </w:r>
     </w:p>
     <w:p>
@@ -2409,15 +2771,57 @@
           <w:lang w:eastAsia="es-EC"/>
         </w:rPr>
       </w:pPr>
-      <w:r>
-        <w:rPr>
-          <w:rFonts w:ascii="Arial" w:hAnsi="Arial" w:cs="Arial"/>
-          <w:i/>
-          <w:iCs/>
-          <w:lang w:eastAsia="es-EC"/>
-        </w:rPr>
-        <w:t>git config –global --list</w:t>
-      </w:r>
+      <w:proofErr w:type="spellStart"/>
+      <w:r>
+        <w:rPr>
+          <w:rFonts w:ascii="Arial" w:hAnsi="Arial" w:cs="Arial"/>
+          <w:i/>
+          <w:iCs/>
+          <w:lang w:eastAsia="es-EC"/>
+        </w:rPr>
+        <w:t>git</w:t>
+      </w:r>
+      <w:proofErr w:type="spellEnd"/>
+      <w:r>
+        <w:rPr>
+          <w:rFonts w:ascii="Arial" w:hAnsi="Arial" w:cs="Arial"/>
+          <w:i/>
+          <w:iCs/>
+          <w:lang w:eastAsia="es-EC"/>
+        </w:rPr>
+        <w:t xml:space="preserve"> </w:t>
+      </w:r>
+      <w:proofErr w:type="spellStart"/>
+      <w:r>
+        <w:rPr>
+          <w:rFonts w:ascii="Arial" w:hAnsi="Arial" w:cs="Arial"/>
+          <w:i/>
+          <w:iCs/>
+          <w:lang w:eastAsia="es-EC"/>
+        </w:rPr>
+        <w:t>config</w:t>
+      </w:r>
+      <w:proofErr w:type="spellEnd"/>
+      <w:r>
+        <w:rPr>
+          <w:rFonts w:ascii="Arial" w:hAnsi="Arial" w:cs="Arial"/>
+          <w:i/>
+          <w:iCs/>
+          <w:lang w:eastAsia="es-EC"/>
+        </w:rPr>
+        <w:t xml:space="preserve"> –global --</w:t>
+      </w:r>
+      <w:proofErr w:type="spellStart"/>
+      <w:r>
+        <w:rPr>
+          <w:rFonts w:ascii="Arial" w:hAnsi="Arial" w:cs="Arial"/>
+          <w:i/>
+          <w:iCs/>
+          <w:lang w:eastAsia="es-EC"/>
+        </w:rPr>
+        <w:t>list</w:t>
+      </w:r>
+      <w:proofErr w:type="spellEnd"/>
     </w:p>
     <w:p>
       <w:pPr>
@@ -2446,9 +2850,9 @@
           <w:noProof/>
         </w:rPr>
         <w:drawing>
-          <wp:inline distT="0" distB="0" distL="0" distR="0" wp14:anchorId="5411C04C" wp14:editId="480B0817">
-            <wp:extent cx="5400040" cy="639445"/>
-            <wp:effectExtent l="0" t="0" r="0" b="8255"/>
+          <wp:inline distT="0" distB="0" distL="0" distR="0" wp14:anchorId="5411C04C" wp14:editId="36893FEE">
+            <wp:extent cx="5791503" cy="685800"/>
+            <wp:effectExtent l="0" t="0" r="0" b="0"/>
             <wp:docPr id="28" name="Imagen 28"/>
             <wp:cNvGraphicFramePr>
               <a:graphicFrameLocks xmlns:a="http://schemas.openxmlformats.org/drawingml/2006/main" noChangeAspect="1"/>
@@ -2469,7 +2873,7 @@
                   <pic:spPr>
                     <a:xfrm>
                       <a:off x="0" y="0"/>
-                      <a:ext cx="5400040" cy="639445"/>
+                      <a:ext cx="5797603" cy="686522"/>
                     </a:xfrm>
                     <a:prstGeom prst="rect">
                       <a:avLst/>
@@ -2526,18 +2930,122 @@
           <w:rFonts w:ascii="Arial" w:hAnsi="Arial" w:cs="Arial"/>
           <w:lang w:eastAsia="es-EC"/>
         </w:rPr>
-        <w:t xml:space="preserve">En este apartado creamos una carpeta vacia, en donde vamos a dar click derecho y seleccionar </w:t>
-      </w:r>
-      <w:r>
-        <w:rPr>
-          <w:rFonts w:ascii="Arial" w:hAnsi="Arial" w:cs="Arial"/>
-          <w:b/>
-          <w:bCs/>
-          <w:i/>
-          <w:iCs/>
-          <w:lang w:eastAsia="es-EC"/>
-        </w:rPr>
-        <w:t>Open git bash here.</w:t>
+        <w:t xml:space="preserve">En este apartado creamos una carpeta </w:t>
+      </w:r>
+      <w:proofErr w:type="spellStart"/>
+      <w:r>
+        <w:rPr>
+          <w:rFonts w:ascii="Arial" w:hAnsi="Arial" w:cs="Arial"/>
+          <w:lang w:eastAsia="es-EC"/>
+        </w:rPr>
+        <w:t>vacia</w:t>
+      </w:r>
+      <w:proofErr w:type="spellEnd"/>
+      <w:r>
+        <w:rPr>
+          <w:rFonts w:ascii="Arial" w:hAnsi="Arial" w:cs="Arial"/>
+          <w:lang w:eastAsia="es-EC"/>
+        </w:rPr>
+        <w:t xml:space="preserve">, en donde vamos a dar </w:t>
+      </w:r>
+      <w:proofErr w:type="spellStart"/>
+      <w:r>
+        <w:rPr>
+          <w:rFonts w:ascii="Arial" w:hAnsi="Arial" w:cs="Arial"/>
+          <w:lang w:eastAsia="es-EC"/>
+        </w:rPr>
+        <w:t>click</w:t>
+      </w:r>
+      <w:proofErr w:type="spellEnd"/>
+      <w:r>
+        <w:rPr>
+          <w:rFonts w:ascii="Arial" w:hAnsi="Arial" w:cs="Arial"/>
+          <w:lang w:eastAsia="es-EC"/>
+        </w:rPr>
+        <w:t xml:space="preserve"> derecho y seleccionar </w:t>
+      </w:r>
+      <w:r>
+        <w:rPr>
+          <w:rFonts w:ascii="Arial" w:hAnsi="Arial" w:cs="Arial"/>
+          <w:b/>
+          <w:bCs/>
+          <w:i/>
+          <w:iCs/>
+          <w:lang w:eastAsia="es-EC"/>
+        </w:rPr>
+        <w:t xml:space="preserve">Open </w:t>
+      </w:r>
+      <w:proofErr w:type="spellStart"/>
+      <w:r>
+        <w:rPr>
+          <w:rFonts w:ascii="Arial" w:hAnsi="Arial" w:cs="Arial"/>
+          <w:b/>
+          <w:bCs/>
+          <w:i/>
+          <w:iCs/>
+          <w:lang w:eastAsia="es-EC"/>
+        </w:rPr>
+        <w:t>git</w:t>
+      </w:r>
+      <w:proofErr w:type="spellEnd"/>
+      <w:r>
+        <w:rPr>
+          <w:rFonts w:ascii="Arial" w:hAnsi="Arial" w:cs="Arial"/>
+          <w:b/>
+          <w:bCs/>
+          <w:i/>
+          <w:iCs/>
+          <w:lang w:eastAsia="es-EC"/>
+        </w:rPr>
+        <w:t xml:space="preserve"> </w:t>
+      </w:r>
+      <w:proofErr w:type="spellStart"/>
+      <w:r>
+        <w:rPr>
+          <w:rFonts w:ascii="Arial" w:hAnsi="Arial" w:cs="Arial"/>
+          <w:b/>
+          <w:bCs/>
+          <w:i/>
+          <w:iCs/>
+          <w:lang w:eastAsia="es-EC"/>
+        </w:rPr>
+        <w:t>bash</w:t>
+      </w:r>
+      <w:proofErr w:type="spellEnd"/>
+      <w:r>
+        <w:rPr>
+          <w:rFonts w:ascii="Arial" w:hAnsi="Arial" w:cs="Arial"/>
+          <w:b/>
+          <w:bCs/>
+          <w:i/>
+          <w:iCs/>
+          <w:lang w:eastAsia="es-EC"/>
+        </w:rPr>
+        <w:t xml:space="preserve"> </w:t>
+      </w:r>
+      <w:proofErr w:type="spellStart"/>
+      <w:r>
+        <w:rPr>
+          <w:rFonts w:ascii="Arial" w:hAnsi="Arial" w:cs="Arial"/>
+          <w:b/>
+          <w:bCs/>
+          <w:i/>
+          <w:iCs/>
+          <w:lang w:eastAsia="es-EC"/>
+        </w:rPr>
+        <w:t>here</w:t>
+      </w:r>
+      <w:proofErr w:type="spellEnd"/>
+      <w:r>
+        <w:rPr>
+          <w:rFonts w:ascii="Arial" w:hAnsi="Arial" w:cs="Arial"/>
+          <w:b/>
+          <w:bCs/>
+          <w:i/>
+          <w:iCs/>
+          <w:lang w:eastAsia="es-EC"/>
+        </w:rPr>
+        <w:t>.</w:t>
       </w:r>
     </w:p>
     <w:p>
@@ -2574,8 +3082,8 @@
           <w:lang w:eastAsia="es-EC"/>
         </w:rPr>
         <w:drawing>
-          <wp:inline distT="0" distB="0" distL="0" distR="0" wp14:anchorId="6A422415" wp14:editId="066F2FA5">
-            <wp:extent cx="4216617" cy="3473629"/>
+          <wp:inline distT="0" distB="0" distL="0" distR="0" wp14:anchorId="6A422415" wp14:editId="1CC2B005">
+            <wp:extent cx="4840766" cy="3987800"/>
             <wp:effectExtent l="0" t="0" r="0" b="0"/>
             <wp:docPr id="30" name="Imagen 30"/>
             <wp:cNvGraphicFramePr>
@@ -2597,7 +3105,7 @@
                   <pic:spPr>
                     <a:xfrm>
                       <a:off x="0" y="0"/>
-                      <a:ext cx="4216617" cy="3473629"/>
+                      <a:ext cx="4850148" cy="3995529"/>
                     </a:xfrm>
                     <a:prstGeom prst="rect">
                       <a:avLst/>
@@ -2621,7 +3129,6 @@
           <w:between w:val="nil"/>
         </w:pBdr>
         <w:spacing w:after="0" w:line="240" w:lineRule="auto"/>
-        <w:jc w:val="center"/>
         <w:rPr>
           <w:rFonts w:ascii="Arial" w:eastAsiaTheme="majorEastAsia" w:hAnsi="Arial" w:cs="Arial"/>
           <w:b/>
@@ -2632,67 +3139,6 @@
           <w:lang w:eastAsia="es-EC"/>
         </w:rPr>
       </w:pPr>
-    </w:p>
-    <w:p>
-      <w:pPr>
-        <w:numPr>
-          <w:ilvl w:val="0"/>
-          <w:numId w:val="5"/>
-        </w:numPr>
-        <w:spacing w:line="256" w:lineRule="auto"/>
-        <w:contextualSpacing/>
-        <w:rPr>
-          <w:rFonts w:ascii="Arial" w:hAnsi="Arial" w:cs="Arial"/>
-          <w:b/>
-          <w:bCs/>
-          <w:lang w:eastAsia="es-EC"/>
-        </w:rPr>
-      </w:pPr>
-      <w:r>
-        <w:rPr>
-          <w:rFonts w:ascii="Arial" w:hAnsi="Arial" w:cs="Arial"/>
-          <w:lang w:eastAsia="es-EC"/>
-        </w:rPr>
-        <w:t xml:space="preserve">Utilizamos el comando </w:t>
-      </w:r>
-      <w:r>
-        <w:rPr>
-          <w:rFonts w:ascii="Arial" w:hAnsi="Arial" w:cs="Arial"/>
-          <w:b/>
-          <w:bCs/>
-          <w:lang w:eastAsia="es-EC"/>
-        </w:rPr>
-        <w:t>GIT INIT</w:t>
-      </w:r>
-      <w:r>
-        <w:rPr>
-          <w:rFonts w:ascii="Arial" w:hAnsi="Arial" w:cs="Arial"/>
-          <w:lang w:eastAsia="es-EC"/>
-        </w:rPr>
-        <w:t xml:space="preserve"> para inicializar el repositorio.</w:t>
-      </w:r>
-    </w:p>
-    <w:p>
-      <w:pPr>
-        <w:spacing w:line="256" w:lineRule="auto"/>
-        <w:ind w:left="360"/>
-        <w:jc w:val="center"/>
-        <w:rPr>
-          <w:rFonts w:ascii="Arial" w:hAnsi="Arial" w:cs="Arial"/>
-          <w:i/>
-          <w:iCs/>
-          <w:lang w:eastAsia="es-EC"/>
-        </w:rPr>
-      </w:pPr>
-      <w:r>
-        <w:rPr>
-          <w:rFonts w:ascii="Arial" w:hAnsi="Arial" w:cs="Arial"/>
-          <w:i/>
-          <w:iCs/>
-          <w:lang w:eastAsia="es-EC"/>
-        </w:rPr>
-        <w:t>git init</w:t>
-      </w:r>
     </w:p>
     <w:p>
       <w:pPr>
@@ -2716,10 +3162,117 @@
           <w:lang w:eastAsia="es-EC"/>
         </w:rPr>
       </w:pPr>
+    </w:p>
+    <w:p>
+      <w:pPr>
+        <w:numPr>
+          <w:ilvl w:val="0"/>
+          <w:numId w:val="5"/>
+        </w:numPr>
+        <w:spacing w:line="256" w:lineRule="auto"/>
+        <w:contextualSpacing/>
+        <w:rPr>
+          <w:rFonts w:ascii="Arial" w:hAnsi="Arial" w:cs="Arial"/>
+          <w:b/>
+          <w:bCs/>
+          <w:lang w:eastAsia="es-EC"/>
+        </w:rPr>
+      </w:pPr>
+      <w:r>
+        <w:rPr>
+          <w:rFonts w:ascii="Arial" w:hAnsi="Arial" w:cs="Arial"/>
+          <w:lang w:eastAsia="es-EC"/>
+        </w:rPr>
+        <w:t xml:space="preserve">Utilizamos el comando </w:t>
+      </w:r>
+      <w:r>
+        <w:rPr>
+          <w:rFonts w:ascii="Arial" w:hAnsi="Arial" w:cs="Arial"/>
+          <w:b/>
+          <w:bCs/>
+          <w:lang w:eastAsia="es-EC"/>
+        </w:rPr>
+        <w:t>GIT INIT</w:t>
+      </w:r>
+      <w:r>
+        <w:rPr>
+          <w:rFonts w:ascii="Arial" w:hAnsi="Arial" w:cs="Arial"/>
+          <w:lang w:eastAsia="es-EC"/>
+        </w:rPr>
+        <w:t xml:space="preserve"> para inicializar el repositorio.</w:t>
+      </w:r>
+    </w:p>
+    <w:p>
+      <w:pPr>
+        <w:spacing w:line="256" w:lineRule="auto"/>
+        <w:ind w:left="360"/>
+        <w:jc w:val="center"/>
+        <w:rPr>
+          <w:rFonts w:ascii="Arial" w:hAnsi="Arial" w:cs="Arial"/>
+          <w:i/>
+          <w:iCs/>
+          <w:lang w:eastAsia="es-EC"/>
+        </w:rPr>
+      </w:pPr>
+      <w:proofErr w:type="spellStart"/>
+      <w:r>
+        <w:rPr>
+          <w:rFonts w:ascii="Arial" w:hAnsi="Arial" w:cs="Arial"/>
+          <w:i/>
+          <w:iCs/>
+          <w:lang w:eastAsia="es-EC"/>
+        </w:rPr>
+        <w:t>git</w:t>
+      </w:r>
+      <w:proofErr w:type="spellEnd"/>
+      <w:r>
+        <w:rPr>
+          <w:rFonts w:ascii="Arial" w:hAnsi="Arial" w:cs="Arial"/>
+          <w:i/>
+          <w:iCs/>
+          <w:lang w:eastAsia="es-EC"/>
+        </w:rPr>
+        <w:t xml:space="preserve"> </w:t>
+      </w:r>
+      <w:proofErr w:type="spellStart"/>
+      <w:r>
+        <w:rPr>
+          <w:rFonts w:ascii="Arial" w:hAnsi="Arial" w:cs="Arial"/>
+          <w:i/>
+          <w:iCs/>
+          <w:lang w:eastAsia="es-EC"/>
+        </w:rPr>
+        <w:t>init</w:t>
+      </w:r>
+      <w:proofErr w:type="spellEnd"/>
+    </w:p>
+    <w:p>
+      <w:pPr>
+        <w:widowControl w:val="0"/>
+        <w:pBdr>
+          <w:top w:val="nil"/>
+          <w:left w:val="nil"/>
+          <w:bottom w:val="nil"/>
+          <w:right w:val="nil"/>
+          <w:between w:val="nil"/>
+        </w:pBdr>
+        <w:spacing w:after="0" w:line="240" w:lineRule="auto"/>
+        <w:jc w:val="center"/>
+        <w:rPr>
+          <w:rFonts w:ascii="Arial" w:eastAsiaTheme="majorEastAsia" w:hAnsi="Arial" w:cs="Arial"/>
+          <w:b/>
+          <w:bCs/>
+          <w:color w:val="0F4761" w:themeColor="accent1" w:themeShade="BF"/>
+          <w:sz w:val="24"/>
+          <w:szCs w:val="24"/>
+          <w:lang w:eastAsia="es-EC"/>
+        </w:rPr>
+      </w:pPr>
       <w:r>
         <w:rPr>
           <w:noProof/>
         </w:rPr>
+        <w:lastRenderedPageBreak/>
         <w:drawing>
           <wp:inline distT="0" distB="0" distL="0" distR="0" wp14:anchorId="728383A3" wp14:editId="3A5DF4FC">
             <wp:extent cx="5400000" cy="1619048"/>
@@ -2804,6 +3357,7 @@
         </w:rPr>
         <w:t xml:space="preserve">Agregamos los </w:t>
       </w:r>
+      <w:proofErr w:type="spellStart"/>
       <w:r>
         <w:rPr>
           <w:rFonts w:ascii="Arial" w:hAnsi="Arial" w:cs="Arial"/>
@@ -2813,6 +3367,7 @@
         </w:rPr>
         <w:t>commit</w:t>
       </w:r>
+      <w:proofErr w:type="spellEnd"/>
       <w:r>
         <w:rPr>
           <w:rFonts w:ascii="Arial" w:hAnsi="Arial" w:cs="Arial"/>
@@ -2820,6 +3375,22 @@
         </w:rPr>
         <w:t xml:space="preserve"> con las observaciones del caso en proceso.</w:t>
       </w:r>
+    </w:p>
+    <w:p>
+      <w:pPr>
+        <w:spacing w:line="256" w:lineRule="auto"/>
+        <w:ind w:left="720"/>
+        <w:contextualSpacing/>
+        <w:rPr>
+          <w:rFonts w:ascii="Arial" w:eastAsiaTheme="majorEastAsia" w:hAnsi="Arial" w:cs="Arial"/>
+          <w:b/>
+          <w:bCs/>
+          <w:color w:val="0F4761" w:themeColor="accent1" w:themeShade="BF"/>
+          <w:sz w:val="24"/>
+          <w:szCs w:val="24"/>
+          <w:lang w:eastAsia="es-EC"/>
+        </w:rPr>
+      </w:pPr>
     </w:p>
     <w:p>
       <w:pPr>
@@ -2847,7 +3418,6 @@
         <w:rPr>
           <w:noProof/>
         </w:rPr>
-        <w:lastRenderedPageBreak/>
         <w:drawing>
           <wp:inline distT="0" distB="0" distL="0" distR="0" wp14:anchorId="418C2942" wp14:editId="3917AE48">
             <wp:extent cx="5400040" cy="1377315"/>
@@ -2940,20 +3510,9 @@
           <w:szCs w:val="24"/>
           <w:lang w:eastAsia="es-EC"/>
         </w:rPr>
-        <w:t xml:space="preserve">Luego agg el </w:t>
-      </w:r>
-      <w:r>
-        <w:rPr>
-          <w:rFonts w:ascii="Arial" w:eastAsiaTheme="majorEastAsia" w:hAnsi="Arial" w:cs="Arial"/>
-          <w:b/>
-          <w:bCs/>
-          <w:color w:val="000000" w:themeColor="text1"/>
-          <w:sz w:val="24"/>
-          <w:szCs w:val="24"/>
-          <w:lang w:eastAsia="es-EC"/>
-        </w:rPr>
-        <w:t>origen</w:t>
-      </w:r>
+        <w:t xml:space="preserve">Luego </w:t>
+      </w:r>
+      <w:proofErr w:type="spellStart"/>
       <w:r>
         <w:rPr>
           <w:rFonts w:ascii="Arial" w:eastAsiaTheme="majorEastAsia" w:hAnsi="Arial" w:cs="Arial"/>
@@ -2962,32 +3521,9 @@
           <w:szCs w:val="24"/>
           <w:lang w:eastAsia="es-EC"/>
         </w:rPr>
-        <w:t xml:space="preserve">, el </w:t>
-      </w:r>
-      <w:r>
-        <w:rPr>
-          <w:rFonts w:ascii="Arial" w:eastAsiaTheme="majorEastAsia" w:hAnsi="Arial" w:cs="Arial"/>
-          <w:b/>
-          <w:bCs/>
-          <w:color w:val="000000" w:themeColor="text1"/>
-          <w:sz w:val="24"/>
-          <w:szCs w:val="24"/>
-          <w:lang w:eastAsia="es-EC"/>
-        </w:rPr>
-        <w:t>b</w:t>
-      </w:r>
-      <w:r>
-        <w:rPr>
-          <w:rFonts w:ascii="Arial" w:eastAsiaTheme="majorEastAsia" w:hAnsi="Arial" w:cs="Arial"/>
-          <w:b/>
-          <w:bCs/>
-          <w:color w:val="000000" w:themeColor="text1"/>
-          <w:sz w:val="24"/>
-          <w:szCs w:val="24"/>
-          <w:lang w:eastAsia="es-EC"/>
-        </w:rPr>
-        <w:t>ranch</w:t>
-      </w:r>
+        <w:t>agg</w:t>
+      </w:r>
+      <w:proofErr w:type="spellEnd"/>
       <w:r>
         <w:rPr>
           <w:rFonts w:ascii="Arial" w:eastAsiaTheme="majorEastAsia" w:hAnsi="Arial" w:cs="Arial"/>
@@ -2996,7 +3532,7 @@
           <w:szCs w:val="24"/>
           <w:lang w:eastAsia="es-EC"/>
         </w:rPr>
-        <w:t xml:space="preserve"> y el </w:t>
+        <w:t xml:space="preserve"> el </w:t>
       </w:r>
       <w:r>
         <w:rPr>
@@ -3008,19 +3544,7 @@
           <w:szCs w:val="24"/>
           <w:lang w:eastAsia="es-EC"/>
         </w:rPr>
-        <w:t>push</w:t>
-      </w:r>
-      <w:r>
-        <w:rPr>
-          <w:rFonts w:ascii="Arial" w:eastAsiaTheme="majorEastAsia" w:hAnsi="Arial" w:cs="Arial"/>
-          <w:b/>
-          <w:bCs/>
-          <w:color w:val="000000" w:themeColor="text1"/>
-          <w:sz w:val="24"/>
-          <w:szCs w:val="24"/>
-          <w:lang w:eastAsia="es-EC"/>
-        </w:rPr>
-        <w:t xml:space="preserve">, </w:t>
+        <w:t>origen</w:t>
       </w:r>
       <w:r>
         <w:rPr>
@@ -3030,7 +3554,135 @@
           <w:szCs w:val="24"/>
           <w:lang w:eastAsia="es-EC"/>
         </w:rPr>
-        <w:t>hací como se muestra en la imagen. Esto se hace para sincronizar y poder ver los cambios en el repositorio de la pagina de git, antes de ello debemos tener la cuenta creada.</w:t>
+        <w:t xml:space="preserve">, el </w:t>
+      </w:r>
+      <w:proofErr w:type="spellStart"/>
+      <w:r>
+        <w:rPr>
+          <w:rFonts w:ascii="Arial" w:eastAsiaTheme="majorEastAsia" w:hAnsi="Arial" w:cs="Arial"/>
+          <w:b/>
+          <w:bCs/>
+          <w:color w:val="000000" w:themeColor="text1"/>
+          <w:sz w:val="24"/>
+          <w:szCs w:val="24"/>
+          <w:lang w:eastAsia="es-EC"/>
+        </w:rPr>
+        <w:t>b</w:t>
+      </w:r>
+      <w:r>
+        <w:rPr>
+          <w:rFonts w:ascii="Arial" w:eastAsiaTheme="majorEastAsia" w:hAnsi="Arial" w:cs="Arial"/>
+          <w:b/>
+          <w:bCs/>
+          <w:color w:val="000000" w:themeColor="text1"/>
+          <w:sz w:val="24"/>
+          <w:szCs w:val="24"/>
+          <w:lang w:eastAsia="es-EC"/>
+        </w:rPr>
+        <w:t>ranch</w:t>
+      </w:r>
+      <w:proofErr w:type="spellEnd"/>
+      <w:r>
+        <w:rPr>
+          <w:rFonts w:ascii="Arial" w:eastAsiaTheme="majorEastAsia" w:hAnsi="Arial" w:cs="Arial"/>
+          <w:color w:val="000000" w:themeColor="text1"/>
+          <w:sz w:val="24"/>
+          <w:szCs w:val="24"/>
+          <w:lang w:eastAsia="es-EC"/>
+        </w:rPr>
+        <w:t xml:space="preserve"> y el </w:t>
+      </w:r>
+      <w:proofErr w:type="spellStart"/>
+      <w:r>
+        <w:rPr>
+          <w:rFonts w:ascii="Arial" w:eastAsiaTheme="majorEastAsia" w:hAnsi="Arial" w:cs="Arial"/>
+          <w:b/>
+          <w:bCs/>
+          <w:color w:val="000000" w:themeColor="text1"/>
+          <w:sz w:val="24"/>
+          <w:szCs w:val="24"/>
+          <w:lang w:eastAsia="es-EC"/>
+        </w:rPr>
+        <w:t>push</w:t>
+      </w:r>
+      <w:proofErr w:type="spellEnd"/>
+      <w:r>
+        <w:rPr>
+          <w:rFonts w:ascii="Arial" w:eastAsiaTheme="majorEastAsia" w:hAnsi="Arial" w:cs="Arial"/>
+          <w:b/>
+          <w:bCs/>
+          <w:color w:val="000000" w:themeColor="text1"/>
+          <w:sz w:val="24"/>
+          <w:szCs w:val="24"/>
+          <w:lang w:eastAsia="es-EC"/>
+        </w:rPr>
+        <w:t xml:space="preserve">, </w:t>
+      </w:r>
+      <w:proofErr w:type="spellStart"/>
+      <w:r>
+        <w:rPr>
+          <w:rFonts w:ascii="Arial" w:eastAsiaTheme="majorEastAsia" w:hAnsi="Arial" w:cs="Arial"/>
+          <w:color w:val="000000" w:themeColor="text1"/>
+          <w:sz w:val="24"/>
+          <w:szCs w:val="24"/>
+          <w:lang w:eastAsia="es-EC"/>
+        </w:rPr>
+        <w:t>hací</w:t>
+      </w:r>
+      <w:proofErr w:type="spellEnd"/>
+      <w:r>
+        <w:rPr>
+          <w:rFonts w:ascii="Arial" w:eastAsiaTheme="majorEastAsia" w:hAnsi="Arial" w:cs="Arial"/>
+          <w:color w:val="000000" w:themeColor="text1"/>
+          <w:sz w:val="24"/>
+          <w:szCs w:val="24"/>
+          <w:lang w:eastAsia="es-EC"/>
+        </w:rPr>
+        <w:t xml:space="preserve"> como se muestra en la imagen. Esto se hace para sincronizar y poder ver los cambios en el repositorio de la </w:t>
+      </w:r>
+      <w:proofErr w:type="spellStart"/>
+      <w:r>
+        <w:rPr>
+          <w:rFonts w:ascii="Arial" w:eastAsiaTheme="majorEastAsia" w:hAnsi="Arial" w:cs="Arial"/>
+          <w:color w:val="000000" w:themeColor="text1"/>
+          <w:sz w:val="24"/>
+          <w:szCs w:val="24"/>
+          <w:lang w:eastAsia="es-EC"/>
+        </w:rPr>
+        <w:t>pagina</w:t>
+      </w:r>
+      <w:proofErr w:type="spellEnd"/>
+      <w:r>
+        <w:rPr>
+          <w:rFonts w:ascii="Arial" w:eastAsiaTheme="majorEastAsia" w:hAnsi="Arial" w:cs="Arial"/>
+          <w:color w:val="000000" w:themeColor="text1"/>
+          <w:sz w:val="24"/>
+          <w:szCs w:val="24"/>
+          <w:lang w:eastAsia="es-EC"/>
+        </w:rPr>
+        <w:t xml:space="preserve"> de </w:t>
+      </w:r>
+      <w:proofErr w:type="spellStart"/>
+      <w:r>
+        <w:rPr>
+          <w:rFonts w:ascii="Arial" w:eastAsiaTheme="majorEastAsia" w:hAnsi="Arial" w:cs="Arial"/>
+          <w:color w:val="000000" w:themeColor="text1"/>
+          <w:sz w:val="24"/>
+          <w:szCs w:val="24"/>
+          <w:lang w:eastAsia="es-EC"/>
+        </w:rPr>
+        <w:t>git</w:t>
+      </w:r>
+      <w:proofErr w:type="spellEnd"/>
+      <w:r>
+        <w:rPr>
+          <w:rFonts w:ascii="Arial" w:eastAsiaTheme="majorEastAsia" w:hAnsi="Arial" w:cs="Arial"/>
+          <w:color w:val="000000" w:themeColor="text1"/>
+          <w:sz w:val="24"/>
+          <w:szCs w:val="24"/>
+          <w:lang w:eastAsia="es-EC"/>
+        </w:rPr>
+        <w:t>, antes de ello debemos tener la cuenta creada.</w:t>
       </w:r>
     </w:p>
     <w:p>
@@ -3151,7 +3803,7 @@
           <w:noProof/>
         </w:rPr>
         <w:drawing>
-          <wp:inline distT="0" distB="0" distL="0" distR="0" wp14:anchorId="61B5A0B4" wp14:editId="0FE309C9">
+          <wp:inline distT="0" distB="0" distL="0" distR="0" wp14:anchorId="61B5A0B4" wp14:editId="1ED9A8ED">
             <wp:extent cx="5400040" cy="1417955"/>
             <wp:effectExtent l="0" t="0" r="0" b="0"/>
             <wp:docPr id="10" name="Imagen 10"/>
@@ -3174,7 +3826,7 @@
                   <pic:spPr>
                     <a:xfrm>
                       <a:off x="0" y="0"/>
-                      <a:ext cx="5400040" cy="1417955"/>
+                      <a:ext cx="5412550" cy="1421240"/>
                     </a:xfrm>
                     <a:prstGeom prst="rect">
                       <a:avLst/>
@@ -3221,6 +3873,97 @@
           <w:between w:val="nil"/>
         </w:pBdr>
         <w:spacing w:after="0" w:line="240" w:lineRule="auto"/>
+        <w:rPr>
+          <w:rFonts w:ascii="Arial" w:eastAsiaTheme="majorEastAsia" w:hAnsi="Arial" w:cs="Arial"/>
+          <w:b/>
+          <w:bCs/>
+          <w:color w:val="000000" w:themeColor="text1"/>
+          <w:sz w:val="24"/>
+          <w:szCs w:val="24"/>
+          <w:lang w:eastAsia="es-EC"/>
+        </w:rPr>
+      </w:pPr>
+      <w:r>
+        <w:rPr>
+          <w:rFonts w:ascii="Arial" w:eastAsiaTheme="majorEastAsia" w:hAnsi="Arial" w:cs="Arial"/>
+          <w:b/>
+          <w:bCs/>
+          <w:color w:val="000000" w:themeColor="text1"/>
+          <w:sz w:val="24"/>
+          <w:szCs w:val="24"/>
+          <w:lang w:eastAsia="es-EC"/>
+        </w:rPr>
+        <w:t>IMAGEN DEL GITHUB</w:t>
+      </w:r>
+      <w:r>
+        <w:rPr>
+          <w:rFonts w:ascii="Arial" w:eastAsiaTheme="majorEastAsia" w:hAnsi="Arial" w:cs="Arial"/>
+          <w:b/>
+          <w:bCs/>
+          <w:color w:val="000000" w:themeColor="text1"/>
+          <w:sz w:val="24"/>
+          <w:szCs w:val="24"/>
+          <w:lang w:eastAsia="es-EC"/>
+        </w:rPr>
+        <w:t xml:space="preserve"> YA CON LOS ARCHIVOS ACTUALIZADOS</w:t>
+      </w:r>
+    </w:p>
+    <w:p>
+      <w:pPr>
+        <w:widowControl w:val="0"/>
+        <w:pBdr>
+          <w:top w:val="nil"/>
+          <w:left w:val="nil"/>
+          <w:bottom w:val="nil"/>
+          <w:right w:val="nil"/>
+          <w:between w:val="nil"/>
+        </w:pBdr>
+        <w:spacing w:after="0" w:line="240" w:lineRule="auto"/>
+        <w:rPr>
+          <w:rFonts w:ascii="Arial" w:eastAsiaTheme="majorEastAsia" w:hAnsi="Arial" w:cs="Arial"/>
+          <w:b/>
+          <w:bCs/>
+          <w:color w:val="000000" w:themeColor="text1"/>
+          <w:sz w:val="24"/>
+          <w:szCs w:val="24"/>
+          <w:lang w:eastAsia="es-EC"/>
+        </w:rPr>
+      </w:pPr>
+    </w:p>
+    <w:p>
+      <w:pPr>
+        <w:widowControl w:val="0"/>
+        <w:pBdr>
+          <w:top w:val="nil"/>
+          <w:left w:val="nil"/>
+          <w:bottom w:val="nil"/>
+          <w:right w:val="nil"/>
+          <w:between w:val="nil"/>
+        </w:pBdr>
+        <w:spacing w:after="0" w:line="240" w:lineRule="auto"/>
+        <w:jc w:val="center"/>
+        <w:rPr>
+          <w:rFonts w:ascii="Arial" w:eastAsiaTheme="majorEastAsia" w:hAnsi="Arial" w:cs="Arial"/>
+          <w:b/>
+          <w:bCs/>
+          <w:color w:val="000000" w:themeColor="text1"/>
+          <w:sz w:val="24"/>
+          <w:szCs w:val="24"/>
+          <w:lang w:eastAsia="es-EC"/>
+        </w:rPr>
+      </w:pPr>
+    </w:p>
+    <w:p>
+      <w:pPr>
+        <w:widowControl w:val="0"/>
+        <w:pBdr>
+          <w:top w:val="nil"/>
+          <w:left w:val="nil"/>
+          <w:bottom w:val="nil"/>
+          <w:right w:val="nil"/>
+          <w:between w:val="nil"/>
+        </w:pBdr>
+        <w:spacing w:after="0" w:line="240" w:lineRule="auto"/>
         <w:jc w:val="center"/>
         <w:rPr>
           <w:rFonts w:ascii="Arial" w:eastAsiaTheme="majorEastAsia" w:hAnsi="Arial" w:cs="Arial"/>
@@ -3235,6 +3978,116 @@
     </w:p>
     <w:p>
       <w:pPr>
+        <w:widowControl w:val="0"/>
+        <w:pBdr>
+          <w:top w:val="nil"/>
+          <w:left w:val="nil"/>
+          <w:bottom w:val="nil"/>
+          <w:right w:val="nil"/>
+          <w:between w:val="nil"/>
+        </w:pBdr>
+        <w:spacing w:after="0" w:line="240" w:lineRule="auto"/>
+        <w:jc w:val="center"/>
+        <w:rPr>
+          <w:rFonts w:ascii="Arial" w:eastAsiaTheme="majorEastAsia" w:hAnsi="Arial" w:cs="Arial"/>
+          <w:b/>
+          <w:bCs/>
+          <w:color w:val="0F4761" w:themeColor="accent1" w:themeShade="BF"/>
+          <w:sz w:val="24"/>
+          <w:szCs w:val="24"/>
+          <w:lang w:eastAsia="es-EC"/>
+        </w:rPr>
+      </w:pPr>
+      <w:r>
+        <w:rPr>
+          <w:noProof/>
+          <w14:ligatures w14:val="standardContextual"/>
+        </w:rPr>
+        <w:drawing>
+          <wp:inline distT="0" distB="0" distL="0" distR="0" wp14:anchorId="19DE3C54" wp14:editId="37A7A3A8">
+            <wp:extent cx="5323840" cy="2663172"/>
+            <wp:effectExtent l="0" t="0" r="0" b="4445"/>
+            <wp:docPr id="7" name="Imagen 7"/>
+            <wp:cNvGraphicFramePr>
+              <a:graphicFrameLocks xmlns:a="http://schemas.openxmlformats.org/drawingml/2006/main" noChangeAspect="1"/>
+            </wp:cNvGraphicFramePr>
+            <a:graphic xmlns:a="http://schemas.openxmlformats.org/drawingml/2006/main">
+              <a:graphicData uri="http://schemas.openxmlformats.org/drawingml/2006/picture">
+                <pic:pic xmlns:pic="http://schemas.openxmlformats.org/drawingml/2006/picture">
+                  <pic:nvPicPr>
+                    <pic:cNvPr id="1" name=""/>
+                    <pic:cNvPicPr/>
+                  </pic:nvPicPr>
+                  <pic:blipFill>
+                    <a:blip r:embed="rId22"/>
+                    <a:stretch>
+                      <a:fillRect/>
+                    </a:stretch>
+                  </pic:blipFill>
+                  <pic:spPr>
+                    <a:xfrm>
+                      <a:off x="0" y="0"/>
+                      <a:ext cx="5329409" cy="2665958"/>
+                    </a:xfrm>
+                    <a:prstGeom prst="rect">
+                      <a:avLst/>
+                    </a:prstGeom>
+                  </pic:spPr>
+                </pic:pic>
+              </a:graphicData>
+            </a:graphic>
+          </wp:inline>
+        </w:drawing>
+      </w:r>
+    </w:p>
+    <w:p>
+      <w:pPr>
+        <w:widowControl w:val="0"/>
+        <w:pBdr>
+          <w:top w:val="nil"/>
+          <w:left w:val="nil"/>
+          <w:bottom w:val="nil"/>
+          <w:right w:val="nil"/>
+          <w:between w:val="nil"/>
+        </w:pBdr>
+        <w:spacing w:after="0" w:line="240" w:lineRule="auto"/>
+        <w:jc w:val="center"/>
+        <w:rPr>
+          <w:rFonts w:ascii="Arial" w:eastAsiaTheme="majorEastAsia" w:hAnsi="Arial" w:cs="Arial"/>
+          <w:b/>
+          <w:bCs/>
+          <w:color w:val="0F4761" w:themeColor="accent1" w:themeShade="BF"/>
+          <w:sz w:val="24"/>
+          <w:szCs w:val="24"/>
+          <w:lang w:eastAsia="es-EC"/>
+        </w:rPr>
+      </w:pPr>
+    </w:p>
+    <w:p>
+      <w:pPr>
+        <w:widowControl w:val="0"/>
+        <w:pBdr>
+          <w:top w:val="nil"/>
+          <w:left w:val="nil"/>
+          <w:bottom w:val="nil"/>
+          <w:right w:val="nil"/>
+          <w:between w:val="nil"/>
+        </w:pBdr>
+        <w:spacing w:after="0" w:line="240" w:lineRule="auto"/>
+        <w:jc w:val="center"/>
+        <w:rPr>
+          <w:rFonts w:ascii="Arial" w:eastAsiaTheme="majorEastAsia" w:hAnsi="Arial" w:cs="Arial"/>
+          <w:b/>
+          <w:bCs/>
+          <w:color w:val="0F4761" w:themeColor="accent1" w:themeShade="BF"/>
+          <w:sz w:val="24"/>
+          <w:szCs w:val="24"/>
+          <w:lang w:eastAsia="es-EC"/>
+        </w:rPr>
+      </w:pPr>
+    </w:p>
+    <w:p>
+      <w:pPr>
         <w:pStyle w:val="Encabezado"/>
         <w:spacing w:line="360" w:lineRule="auto"/>
         <w:jc w:val="both"/>
@@ -3274,7 +4127,7 @@
       </w:r>
     </w:p>
     <w:sectPr>
-      <w:headerReference w:type="first" r:id="rId22"/>
+      <w:headerReference w:type="first" r:id="rId23"/>
       <w:pgSz w:w="11906" w:h="16838"/>
       <w:pgMar w:top="1417" w:right="1701" w:bottom="1702" w:left="1701" w:header="708" w:footer="708" w:gutter="0"/>
       <w:pgNumType w:start="1"/>

</xml_diff>